<commit_message>
Rehacer Certamen 2 con el nivel de dificultad del certamen de referencia
Co-Authored-By: Claude Sonnet 5.5 <noreply@anthropic.com>
Claude-Session: https://claude.ai/code/session_01AkNEH9QvRP5iSWKqiGfSq1
</commit_message>
<xml_diff>
--- a/Certamen2_Pauta.docx
+++ b/Certamen2_Pauta.docx
@@ -59,7 +59,7 @@
           </w:tcPr>
           <w:p>
             <w:r>
-              <w:t>B</w:t>
+              <w:t>D</w:t>
             </w:r>
           </w:p>
         </w:tc>
@@ -103,7 +103,7 @@
           </w:tcPr>
           <w:p>
             <w:r>
-              <w:t>A</w:t>
+              <w:t>B</w:t>
             </w:r>
           </w:p>
         </w:tc>
@@ -125,7 +125,7 @@
           </w:tcPr>
           <w:p>
             <w:r>
-              <w:t>B</w:t>
+              <w:t>C</w:t>
             </w:r>
           </w:p>
         </w:tc>
@@ -213,7 +213,7 @@
           </w:tcPr>
           <w:p>
             <w:r>
-              <w:t>D</w:t>
+              <w:t>C</w:t>
             </w:r>
           </w:p>
         </w:tc>
@@ -257,7 +257,7 @@
           </w:tcPr>
           <w:p>
             <w:r>
-              <w:t>A</w:t>
+              <w:t>D</w:t>
             </w:r>
           </w:p>
         </w:tc>
@@ -323,7 +323,7 @@
           </w:tcPr>
           <w:p>
             <w:r>
-              <w:t>A</w:t>
+              <w:t>C</w:t>
             </w:r>
           </w:p>
         </w:tc>
@@ -345,7 +345,7 @@
           </w:tcPr>
           <w:p>
             <w:r>
-              <w:t>D</w:t>
+              <w:t>C</w:t>
             </w:r>
           </w:p>
         </w:tc>
@@ -367,7 +367,7 @@
           </w:tcPr>
           <w:p>
             <w:r>
-              <w:t>C</w:t>
+              <w:t>D</w:t>
             </w:r>
           </w:p>
         </w:tc>
@@ -389,7 +389,7 @@
           </w:tcPr>
           <w:p>
             <w:r>
-              <w:t>B</w:t>
+              <w:t>D</w:t>
             </w:r>
           </w:p>
         </w:tc>
@@ -433,7 +433,7 @@
           </w:tcPr>
           <w:p>
             <w:r>
-              <w:t>A</w:t>
+              <w:t>C</w:t>
             </w:r>
           </w:p>
         </w:tc>
@@ -455,7 +455,7 @@
           </w:tcPr>
           <w:p>
             <w:r>
-              <w:t>C</w:t>
+              <w:t>B</w:t>
             </w:r>
           </w:p>
         </w:tc>
@@ -521,7 +521,7 @@
           </w:tcPr>
           <w:p>
             <w:r>
-              <w:t>A</w:t>
+              <w:t>D</w:t>
             </w:r>
           </w:p>
         </w:tc>
@@ -543,7 +543,7 @@
           </w:tcPr>
           <w:p>
             <w:r>
-              <w:t>B</w:t>
+              <w:t>C</w:t>
             </w:r>
           </w:p>
         </w:tc>
@@ -565,7 +565,7 @@
           </w:tcPr>
           <w:p>
             <w:r>
-              <w:t>C</w:t>
+              <w:t>A</w:t>
             </w:r>
           </w:p>
         </w:tc>
@@ -587,7 +587,7 @@
           </w:tcPr>
           <w:p>
             <w:r>
-              <w:t>B</w:t>
+              <w:t>A</w:t>
             </w:r>
           </w:p>
         </w:tc>
@@ -609,7 +609,7 @@
           </w:tcPr>
           <w:p>
             <w:r>
-              <w:t>D</w:t>
+              <w:t>B</w:t>
             </w:r>
           </w:p>
         </w:tc>
@@ -675,7 +675,7 @@
           </w:tcPr>
           <w:p>
             <w:r>
-              <w:t>C</w:t>
+              <w:t>A</w:t>
             </w:r>
           </w:p>
         </w:tc>
@@ -719,7 +719,7 @@
           </w:tcPr>
           <w:p>
             <w:r>
-              <w:t>A</w:t>
+              <w:t>B</w:t>
             </w:r>
           </w:p>
         </w:tc>
@@ -741,7 +741,7 @@
           </w:tcPr>
           <w:p>
             <w:r>
-              <w:t>B</w:t>
+              <w:t>A</w:t>
             </w:r>
           </w:p>
         </w:tc>
@@ -763,7 +763,7 @@
           </w:tcPr>
           <w:p>
             <w:r>
-              <w:t>C</w:t>
+              <w:t>D</w:t>
             </w:r>
           </w:p>
         </w:tc>
@@ -785,7 +785,7 @@
           </w:tcPr>
           <w:p>
             <w:r>
-              <w:t>B</w:t>
+              <w:t>A</w:t>
             </w:r>
           </w:p>
         </w:tc>
@@ -829,7 +829,7 @@
           </w:tcPr>
           <w:p>
             <w:r>
-              <w:t>D</w:t>
+              <w:t>B</w:t>
             </w:r>
           </w:p>
         </w:tc>
@@ -851,7 +851,7 @@
           </w:tcPr>
           <w:p>
             <w:r>
-              <w:t>C</w:t>
+              <w:t>A</w:t>
             </w:r>
           </w:p>
         </w:tc>
@@ -873,7 +873,7 @@
           </w:tcPr>
           <w:p>
             <w:r>
-              <w:t>A</w:t>
+              <w:t>D</w:t>
             </w:r>
           </w:p>
         </w:tc>
@@ -895,7 +895,7 @@
           </w:tcPr>
           <w:p>
             <w:r>
-              <w:t>C</w:t>
+              <w:t>B</w:t>
             </w:r>
           </w:p>
         </w:tc>
@@ -917,7 +917,7 @@
           </w:tcPr>
           <w:p>
             <w:r>
-              <w:t>B</w:t>
+              <w:t>C</w:t>
             </w:r>
           </w:p>
         </w:tc>

</xml_diff>

<commit_message>
Agregar clase de origen a la pauta del Certamen 2
Co-Authored-By: Claude Sonnet 5.5 <noreply@anthropic.com>
Claude-Session: https://claude.ai/code/session_01AkNEH9QvRP5iSWKqiGfSq1
</commit_message>
<xml_diff>
--- a/Certamen2_Pauta.docx
+++ b/Certamen2_Pauta.docx
@@ -17,13 +17,14 @@
         <w:tblLook w:firstColumn="1" w:firstRow="1" w:lastColumn="0" w:lastRow="0" w:noHBand="0" w:noVBand="1" w:val="04A0"/>
       </w:tblPr>
       <w:tblGrid>
-        <w:gridCol w:w="4320"/>
-        <w:gridCol w:w="4320"/>
+        <w:gridCol w:w="2880"/>
+        <w:gridCol w:w="2880"/>
+        <w:gridCol w:w="2880"/>
       </w:tblGrid>
       <w:tr>
         <w:tc>
           <w:tcPr>
-            <w:tcW w:type="dxa" w:w="4320"/>
+            <w:tcW w:type="dxa" w:w="2880"/>
           </w:tcPr>
           <w:p>
             <w:r>
@@ -33,7 +34,7 @@
         </w:tc>
         <w:tc>
           <w:tcPr>
-            <w:tcW w:type="dxa" w:w="4320"/>
+            <w:tcW w:type="dxa" w:w="2880"/>
           </w:tcPr>
           <w:p>
             <w:r>
@@ -41,11 +42,21 @@
             </w:r>
           </w:p>
         </w:tc>
+        <w:tc>
+          <w:tcPr>
+            <w:tcW w:type="dxa" w:w="2880"/>
+          </w:tcPr>
+          <w:p>
+            <w:r>
+              <w:t>Clase / contenido</w:t>
+            </w:r>
+          </w:p>
+        </w:tc>
       </w:tr>
       <w:tr>
         <w:tc>
           <w:tcPr>
-            <w:tcW w:type="dxa" w:w="4320"/>
+            <w:tcW w:type="dxa" w:w="2880"/>
           </w:tcPr>
           <w:p>
             <w:r>
@@ -55,7 +66,7 @@
         </w:tc>
         <w:tc>
           <w:tcPr>
-            <w:tcW w:type="dxa" w:w="4320"/>
+            <w:tcW w:type="dxa" w:w="2880"/>
           </w:tcPr>
           <w:p>
             <w:r>
@@ -63,11 +74,21 @@
             </w:r>
           </w:p>
         </w:tc>
+        <w:tc>
+          <w:tcPr>
+            <w:tcW w:type="dxa" w:w="2880"/>
+          </w:tcPr>
+          <w:p>
+            <w:r>
+              <w:t>Materiales y Métodos (Dr. Marro)</w:t>
+            </w:r>
+          </w:p>
+        </w:tc>
       </w:tr>
       <w:tr>
         <w:tc>
           <w:tcPr>
-            <w:tcW w:type="dxa" w:w="4320"/>
+            <w:tcW w:type="dxa" w:w="2880"/>
           </w:tcPr>
           <w:p>
             <w:r>
@@ -77,7 +98,7 @@
         </w:tc>
         <w:tc>
           <w:tcPr>
-            <w:tcW w:type="dxa" w:w="4320"/>
+            <w:tcW w:type="dxa" w:w="2880"/>
           </w:tcPr>
           <w:p>
             <w:r>
@@ -85,11 +106,21 @@
             </w:r>
           </w:p>
         </w:tc>
+        <w:tc>
+          <w:tcPr>
+            <w:tcW w:type="dxa" w:w="2880"/>
+          </w:tcPr>
+          <w:p>
+            <w:r>
+              <w:t>Materiales y Métodos (Dr. Marro)</w:t>
+            </w:r>
+          </w:p>
+        </w:tc>
       </w:tr>
       <w:tr>
         <w:tc>
           <w:tcPr>
-            <w:tcW w:type="dxa" w:w="4320"/>
+            <w:tcW w:type="dxa" w:w="2880"/>
           </w:tcPr>
           <w:p>
             <w:r>
@@ -99,7 +130,7 @@
         </w:tc>
         <w:tc>
           <w:tcPr>
-            <w:tcW w:type="dxa" w:w="4320"/>
+            <w:tcW w:type="dxa" w:w="2880"/>
           </w:tcPr>
           <w:p>
             <w:r>
@@ -107,11 +138,21 @@
             </w:r>
           </w:p>
         </w:tc>
+        <w:tc>
+          <w:tcPr>
+            <w:tcW w:type="dxa" w:w="2880"/>
+          </w:tcPr>
+          <w:p>
+            <w:r>
+              <w:t>Materiales y Métodos (Dr. Marro)</w:t>
+            </w:r>
+          </w:p>
+        </w:tc>
       </w:tr>
       <w:tr>
         <w:tc>
           <w:tcPr>
-            <w:tcW w:type="dxa" w:w="4320"/>
+            <w:tcW w:type="dxa" w:w="2880"/>
           </w:tcPr>
           <w:p>
             <w:r>
@@ -121,7 +162,7 @@
         </w:tc>
         <w:tc>
           <w:tcPr>
-            <w:tcW w:type="dxa" w:w="4320"/>
+            <w:tcW w:type="dxa" w:w="2880"/>
           </w:tcPr>
           <w:p>
             <w:r>
@@ -129,11 +170,21 @@
             </w:r>
           </w:p>
         </w:tc>
+        <w:tc>
+          <w:tcPr>
+            <w:tcW w:type="dxa" w:w="2880"/>
+          </w:tcPr>
+          <w:p>
+            <w:r>
+              <w:t>Materiales y Métodos (Dr. Marro)</w:t>
+            </w:r>
+          </w:p>
+        </w:tc>
       </w:tr>
       <w:tr>
         <w:tc>
           <w:tcPr>
-            <w:tcW w:type="dxa" w:w="4320"/>
+            <w:tcW w:type="dxa" w:w="2880"/>
           </w:tcPr>
           <w:p>
             <w:r>
@@ -143,7 +194,7 @@
         </w:tc>
         <w:tc>
           <w:tcPr>
-            <w:tcW w:type="dxa" w:w="4320"/>
+            <w:tcW w:type="dxa" w:w="2880"/>
           </w:tcPr>
           <w:p>
             <w:r>
@@ -151,11 +202,21 @@
             </w:r>
           </w:p>
         </w:tc>
+        <w:tc>
+          <w:tcPr>
+            <w:tcW w:type="dxa" w:w="2880"/>
+          </w:tcPr>
+          <w:p>
+            <w:r>
+              <w:t>Materiales y Métodos (Dr. Marro)</w:t>
+            </w:r>
+          </w:p>
+        </w:tc>
       </w:tr>
       <w:tr>
         <w:tc>
           <w:tcPr>
-            <w:tcW w:type="dxa" w:w="4320"/>
+            <w:tcW w:type="dxa" w:w="2880"/>
           </w:tcPr>
           <w:p>
             <w:r>
@@ -165,7 +226,7 @@
         </w:tc>
         <w:tc>
           <w:tcPr>
-            <w:tcW w:type="dxa" w:w="4320"/>
+            <w:tcW w:type="dxa" w:w="2880"/>
           </w:tcPr>
           <w:p>
             <w:r>
@@ -173,11 +234,21 @@
             </w:r>
           </w:p>
         </w:tc>
+        <w:tc>
+          <w:tcPr>
+            <w:tcW w:type="dxa" w:w="2880"/>
+          </w:tcPr>
+          <w:p>
+            <w:r>
+              <w:t>Metodología de revisiones (Klgo. Ramos)</w:t>
+            </w:r>
+          </w:p>
+        </w:tc>
       </w:tr>
       <w:tr>
         <w:tc>
           <w:tcPr>
-            <w:tcW w:type="dxa" w:w="4320"/>
+            <w:tcW w:type="dxa" w:w="2880"/>
           </w:tcPr>
           <w:p>
             <w:r>
@@ -187,7 +258,7 @@
         </w:tc>
         <w:tc>
           <w:tcPr>
-            <w:tcW w:type="dxa" w:w="4320"/>
+            <w:tcW w:type="dxa" w:w="2880"/>
           </w:tcPr>
           <w:p>
             <w:r>
@@ -195,11 +266,21 @@
             </w:r>
           </w:p>
         </w:tc>
+        <w:tc>
+          <w:tcPr>
+            <w:tcW w:type="dxa" w:w="2880"/>
+          </w:tcPr>
+          <w:p>
+            <w:r>
+              <w:t>Metodología de revisiones (Klgo. Ramos)</w:t>
+            </w:r>
+          </w:p>
+        </w:tc>
       </w:tr>
       <w:tr>
         <w:tc>
           <w:tcPr>
-            <w:tcW w:type="dxa" w:w="4320"/>
+            <w:tcW w:type="dxa" w:w="2880"/>
           </w:tcPr>
           <w:p>
             <w:r>
@@ -209,7 +290,7 @@
         </w:tc>
         <w:tc>
           <w:tcPr>
-            <w:tcW w:type="dxa" w:w="4320"/>
+            <w:tcW w:type="dxa" w:w="2880"/>
           </w:tcPr>
           <w:p>
             <w:r>
@@ -217,11 +298,21 @@
             </w:r>
           </w:p>
         </w:tc>
+        <w:tc>
+          <w:tcPr>
+            <w:tcW w:type="dxa" w:w="2880"/>
+          </w:tcPr>
+          <w:p>
+            <w:r>
+              <w:t>Metodología de revisiones (Klgo. Ramos)</w:t>
+            </w:r>
+          </w:p>
+        </w:tc>
       </w:tr>
       <w:tr>
         <w:tc>
           <w:tcPr>
-            <w:tcW w:type="dxa" w:w="4320"/>
+            <w:tcW w:type="dxa" w:w="2880"/>
           </w:tcPr>
           <w:p>
             <w:r>
@@ -231,7 +322,7 @@
         </w:tc>
         <w:tc>
           <w:tcPr>
-            <w:tcW w:type="dxa" w:w="4320"/>
+            <w:tcW w:type="dxa" w:w="2880"/>
           </w:tcPr>
           <w:p>
             <w:r>
@@ -239,11 +330,21 @@
             </w:r>
           </w:p>
         </w:tc>
+        <w:tc>
+          <w:tcPr>
+            <w:tcW w:type="dxa" w:w="2880"/>
+          </w:tcPr>
+          <w:p>
+            <w:r>
+              <w:t>Metodología de revisiones (Klgo. Ramos)</w:t>
+            </w:r>
+          </w:p>
+        </w:tc>
       </w:tr>
       <w:tr>
         <w:tc>
           <w:tcPr>
-            <w:tcW w:type="dxa" w:w="4320"/>
+            <w:tcW w:type="dxa" w:w="2880"/>
           </w:tcPr>
           <w:p>
             <w:r>
@@ -253,7 +354,7 @@
         </w:tc>
         <w:tc>
           <w:tcPr>
-            <w:tcW w:type="dxa" w:w="4320"/>
+            <w:tcW w:type="dxa" w:w="2880"/>
           </w:tcPr>
           <w:p>
             <w:r>
@@ -261,11 +362,21 @@
             </w:r>
           </w:p>
         </w:tc>
+        <w:tc>
+          <w:tcPr>
+            <w:tcW w:type="dxa" w:w="2880"/>
+          </w:tcPr>
+          <w:p>
+            <w:r>
+              <w:t>Metodología de revisiones (Klgo. Ramos) *</w:t>
+            </w:r>
+          </w:p>
+        </w:tc>
       </w:tr>
       <w:tr>
         <w:tc>
           <w:tcPr>
-            <w:tcW w:type="dxa" w:w="4320"/>
+            <w:tcW w:type="dxa" w:w="2880"/>
           </w:tcPr>
           <w:p>
             <w:r>
@@ -275,7 +386,7 @@
         </w:tc>
         <w:tc>
           <w:tcPr>
-            <w:tcW w:type="dxa" w:w="4320"/>
+            <w:tcW w:type="dxa" w:w="2880"/>
           </w:tcPr>
           <w:p>
             <w:r>
@@ -283,11 +394,21 @@
             </w:r>
           </w:p>
         </w:tc>
+        <w:tc>
+          <w:tcPr>
+            <w:tcW w:type="dxa" w:w="2880"/>
+          </w:tcPr>
+          <w:p>
+            <w:r>
+              <w:t>Metodología de revisiones (Klgo. Ramos) *</w:t>
+            </w:r>
+          </w:p>
+        </w:tc>
       </w:tr>
       <w:tr>
         <w:tc>
           <w:tcPr>
-            <w:tcW w:type="dxa" w:w="4320"/>
+            <w:tcW w:type="dxa" w:w="2880"/>
           </w:tcPr>
           <w:p>
             <w:r>
@@ -297,7 +418,7 @@
         </w:tc>
         <w:tc>
           <w:tcPr>
-            <w:tcW w:type="dxa" w:w="4320"/>
+            <w:tcW w:type="dxa" w:w="2880"/>
           </w:tcPr>
           <w:p>
             <w:r>
@@ -305,11 +426,21 @@
             </w:r>
           </w:p>
         </w:tc>
+        <w:tc>
+          <w:tcPr>
+            <w:tcW w:type="dxa" w:w="2880"/>
+          </w:tcPr>
+          <w:p>
+            <w:r>
+              <w:t>Metodología de revisiones (Klgo. Ramos) *</w:t>
+            </w:r>
+          </w:p>
+        </w:tc>
       </w:tr>
       <w:tr>
         <w:tc>
           <w:tcPr>
-            <w:tcW w:type="dxa" w:w="4320"/>
+            <w:tcW w:type="dxa" w:w="2880"/>
           </w:tcPr>
           <w:p>
             <w:r>
@@ -319,7 +450,7 @@
         </w:tc>
         <w:tc>
           <w:tcPr>
-            <w:tcW w:type="dxa" w:w="4320"/>
+            <w:tcW w:type="dxa" w:w="2880"/>
           </w:tcPr>
           <w:p>
             <w:r>
@@ -327,11 +458,21 @@
             </w:r>
           </w:p>
         </w:tc>
+        <w:tc>
+          <w:tcPr>
+            <w:tcW w:type="dxa" w:w="2880"/>
+          </w:tcPr>
+          <w:p>
+            <w:r>
+              <w:t>Metodología de revisiones (Klgo. Ramos) *</w:t>
+            </w:r>
+          </w:p>
+        </w:tc>
       </w:tr>
       <w:tr>
         <w:tc>
           <w:tcPr>
-            <w:tcW w:type="dxa" w:w="4320"/>
+            <w:tcW w:type="dxa" w:w="2880"/>
           </w:tcPr>
           <w:p>
             <w:r>
@@ -341,7 +482,7 @@
         </w:tc>
         <w:tc>
           <w:tcPr>
-            <w:tcW w:type="dxa" w:w="4320"/>
+            <w:tcW w:type="dxa" w:w="2880"/>
           </w:tcPr>
           <w:p>
             <w:r>
@@ -349,11 +490,21 @@
             </w:r>
           </w:p>
         </w:tc>
+        <w:tc>
+          <w:tcPr>
+            <w:tcW w:type="dxa" w:w="2880"/>
+          </w:tcPr>
+          <w:p>
+            <w:r>
+              <w:t>Metodología de revisiones (Klgo. Ramos) *</w:t>
+            </w:r>
+          </w:p>
+        </w:tc>
       </w:tr>
       <w:tr>
         <w:tc>
           <w:tcPr>
-            <w:tcW w:type="dxa" w:w="4320"/>
+            <w:tcW w:type="dxa" w:w="2880"/>
           </w:tcPr>
           <w:p>
             <w:r>
@@ -363,7 +514,7 @@
         </w:tc>
         <w:tc>
           <w:tcPr>
-            <w:tcW w:type="dxa" w:w="4320"/>
+            <w:tcW w:type="dxa" w:w="2880"/>
           </w:tcPr>
           <w:p>
             <w:r>
@@ -371,11 +522,21 @@
             </w:r>
           </w:p>
         </w:tc>
+        <w:tc>
+          <w:tcPr>
+            <w:tcW w:type="dxa" w:w="2880"/>
+          </w:tcPr>
+          <w:p>
+            <w:r>
+              <w:t>Metodología de revisiones (Klgo. Ramos)</w:t>
+            </w:r>
+          </w:p>
+        </w:tc>
       </w:tr>
       <w:tr>
         <w:tc>
           <w:tcPr>
-            <w:tcW w:type="dxa" w:w="4320"/>
+            <w:tcW w:type="dxa" w:w="2880"/>
           </w:tcPr>
           <w:p>
             <w:r>
@@ -385,7 +546,7 @@
         </w:tc>
         <w:tc>
           <w:tcPr>
-            <w:tcW w:type="dxa" w:w="4320"/>
+            <w:tcW w:type="dxa" w:w="2880"/>
           </w:tcPr>
           <w:p>
             <w:r>
@@ -393,11 +554,21 @@
             </w:r>
           </w:p>
         </w:tc>
+        <w:tc>
+          <w:tcPr>
+            <w:tcW w:type="dxa" w:w="2880"/>
+          </w:tcPr>
+          <w:p>
+            <w:r>
+              <w:t>Ética (Dr. Godoy)</w:t>
+            </w:r>
+          </w:p>
+        </w:tc>
       </w:tr>
       <w:tr>
         <w:tc>
           <w:tcPr>
-            <w:tcW w:type="dxa" w:w="4320"/>
+            <w:tcW w:type="dxa" w:w="2880"/>
           </w:tcPr>
           <w:p>
             <w:r>
@@ -407,7 +578,7 @@
         </w:tc>
         <w:tc>
           <w:tcPr>
-            <w:tcW w:type="dxa" w:w="4320"/>
+            <w:tcW w:type="dxa" w:w="2880"/>
           </w:tcPr>
           <w:p>
             <w:r>
@@ -415,11 +586,21 @@
             </w:r>
           </w:p>
         </w:tc>
+        <w:tc>
+          <w:tcPr>
+            <w:tcW w:type="dxa" w:w="2880"/>
+          </w:tcPr>
+          <w:p>
+            <w:r>
+              <w:t>Ética (Dr. Godoy)</w:t>
+            </w:r>
+          </w:p>
+        </w:tc>
       </w:tr>
       <w:tr>
         <w:tc>
           <w:tcPr>
-            <w:tcW w:type="dxa" w:w="4320"/>
+            <w:tcW w:type="dxa" w:w="2880"/>
           </w:tcPr>
           <w:p>
             <w:r>
@@ -429,7 +610,7 @@
         </w:tc>
         <w:tc>
           <w:tcPr>
-            <w:tcW w:type="dxa" w:w="4320"/>
+            <w:tcW w:type="dxa" w:w="2880"/>
           </w:tcPr>
           <w:p>
             <w:r>
@@ -437,11 +618,21 @@
             </w:r>
           </w:p>
         </w:tc>
+        <w:tc>
+          <w:tcPr>
+            <w:tcW w:type="dxa" w:w="2880"/>
+          </w:tcPr>
+          <w:p>
+            <w:r>
+              <w:t>Ética (Dr. Godoy)</w:t>
+            </w:r>
+          </w:p>
+        </w:tc>
       </w:tr>
       <w:tr>
         <w:tc>
           <w:tcPr>
-            <w:tcW w:type="dxa" w:w="4320"/>
+            <w:tcW w:type="dxa" w:w="2880"/>
           </w:tcPr>
           <w:p>
             <w:r>
@@ -451,7 +642,7 @@
         </w:tc>
         <w:tc>
           <w:tcPr>
-            <w:tcW w:type="dxa" w:w="4320"/>
+            <w:tcW w:type="dxa" w:w="2880"/>
           </w:tcPr>
           <w:p>
             <w:r>
@@ -459,11 +650,21 @@
             </w:r>
           </w:p>
         </w:tc>
+        <w:tc>
+          <w:tcPr>
+            <w:tcW w:type="dxa" w:w="2880"/>
+          </w:tcPr>
+          <w:p>
+            <w:r>
+              <w:t>Ética (Dr. Godoy)</w:t>
+            </w:r>
+          </w:p>
+        </w:tc>
       </w:tr>
       <w:tr>
         <w:tc>
           <w:tcPr>
-            <w:tcW w:type="dxa" w:w="4320"/>
+            <w:tcW w:type="dxa" w:w="2880"/>
           </w:tcPr>
           <w:p>
             <w:r>
@@ -473,7 +674,7 @@
         </w:tc>
         <w:tc>
           <w:tcPr>
-            <w:tcW w:type="dxa" w:w="4320"/>
+            <w:tcW w:type="dxa" w:w="2880"/>
           </w:tcPr>
           <w:p>
             <w:r>
@@ -481,11 +682,21 @@
             </w:r>
           </w:p>
         </w:tc>
+        <w:tc>
+          <w:tcPr>
+            <w:tcW w:type="dxa" w:w="2880"/>
+          </w:tcPr>
+          <w:p>
+            <w:r>
+              <w:t>Ética (Dr. Godoy)</w:t>
+            </w:r>
+          </w:p>
+        </w:tc>
       </w:tr>
       <w:tr>
         <w:tc>
           <w:tcPr>
-            <w:tcW w:type="dxa" w:w="4320"/>
+            <w:tcW w:type="dxa" w:w="2880"/>
           </w:tcPr>
           <w:p>
             <w:r>
@@ -495,7 +706,7 @@
         </w:tc>
         <w:tc>
           <w:tcPr>
-            <w:tcW w:type="dxa" w:w="4320"/>
+            <w:tcW w:type="dxa" w:w="2880"/>
           </w:tcPr>
           <w:p>
             <w:r>
@@ -503,11 +714,21 @@
             </w:r>
           </w:p>
         </w:tc>
+        <w:tc>
+          <w:tcPr>
+            <w:tcW w:type="dxa" w:w="2880"/>
+          </w:tcPr>
+          <w:p>
+            <w:r>
+              <w:t>Ética (Dr. Godoy)</w:t>
+            </w:r>
+          </w:p>
+        </w:tc>
       </w:tr>
       <w:tr>
         <w:tc>
           <w:tcPr>
-            <w:tcW w:type="dxa" w:w="4320"/>
+            <w:tcW w:type="dxa" w:w="2880"/>
           </w:tcPr>
           <w:p>
             <w:r>
@@ -517,7 +738,7 @@
         </w:tc>
         <w:tc>
           <w:tcPr>
-            <w:tcW w:type="dxa" w:w="4320"/>
+            <w:tcW w:type="dxa" w:w="2880"/>
           </w:tcPr>
           <w:p>
             <w:r>
@@ -525,11 +746,21 @@
             </w:r>
           </w:p>
         </w:tc>
+        <w:tc>
+          <w:tcPr>
+            <w:tcW w:type="dxa" w:w="2880"/>
+          </w:tcPr>
+          <w:p>
+            <w:r>
+              <w:t>Ética (Dr. Godoy)</w:t>
+            </w:r>
+          </w:p>
+        </w:tc>
       </w:tr>
       <w:tr>
         <w:tc>
           <w:tcPr>
-            <w:tcW w:type="dxa" w:w="4320"/>
+            <w:tcW w:type="dxa" w:w="2880"/>
           </w:tcPr>
           <w:p>
             <w:r>
@@ -539,7 +770,7 @@
         </w:tc>
         <w:tc>
           <w:tcPr>
-            <w:tcW w:type="dxa" w:w="4320"/>
+            <w:tcW w:type="dxa" w:w="2880"/>
           </w:tcPr>
           <w:p>
             <w:r>
@@ -547,11 +778,21 @@
             </w:r>
           </w:p>
         </w:tc>
+        <w:tc>
+          <w:tcPr>
+            <w:tcW w:type="dxa" w:w="2880"/>
+          </w:tcPr>
+          <w:p>
+            <w:r>
+              <w:t>Ética (Dr. Godoy)</w:t>
+            </w:r>
+          </w:p>
+        </w:tc>
       </w:tr>
       <w:tr>
         <w:tc>
           <w:tcPr>
-            <w:tcW w:type="dxa" w:w="4320"/>
+            <w:tcW w:type="dxa" w:w="2880"/>
           </w:tcPr>
           <w:p>
             <w:r>
@@ -561,7 +802,7 @@
         </w:tc>
         <w:tc>
           <w:tcPr>
-            <w:tcW w:type="dxa" w:w="4320"/>
+            <w:tcW w:type="dxa" w:w="2880"/>
           </w:tcPr>
           <w:p>
             <w:r>
@@ -569,11 +810,21 @@
             </w:r>
           </w:p>
         </w:tc>
+        <w:tc>
+          <w:tcPr>
+            <w:tcW w:type="dxa" w:w="2880"/>
+          </w:tcPr>
+          <w:p>
+            <w:r>
+              <w:t>Formato de protocolo (procedimientos del estudio) *</w:t>
+            </w:r>
+          </w:p>
+        </w:tc>
       </w:tr>
       <w:tr>
         <w:tc>
           <w:tcPr>
-            <w:tcW w:type="dxa" w:w="4320"/>
+            <w:tcW w:type="dxa" w:w="2880"/>
           </w:tcPr>
           <w:p>
             <w:r>
@@ -583,7 +834,7 @@
         </w:tc>
         <w:tc>
           <w:tcPr>
-            <w:tcW w:type="dxa" w:w="4320"/>
+            <w:tcW w:type="dxa" w:w="2880"/>
           </w:tcPr>
           <w:p>
             <w:r>
@@ -591,11 +842,21 @@
             </w:r>
           </w:p>
         </w:tc>
+        <w:tc>
+          <w:tcPr>
+            <w:tcW w:type="dxa" w:w="2880"/>
+          </w:tcPr>
+          <w:p>
+            <w:r>
+              <w:t>Ética (Dr. Godoy)</w:t>
+            </w:r>
+          </w:p>
+        </w:tc>
       </w:tr>
       <w:tr>
         <w:tc>
           <w:tcPr>
-            <w:tcW w:type="dxa" w:w="4320"/>
+            <w:tcW w:type="dxa" w:w="2880"/>
           </w:tcPr>
           <w:p>
             <w:r>
@@ -605,7 +866,7 @@
         </w:tc>
         <w:tc>
           <w:tcPr>
-            <w:tcW w:type="dxa" w:w="4320"/>
+            <w:tcW w:type="dxa" w:w="2880"/>
           </w:tcPr>
           <w:p>
             <w:r>
@@ -613,11 +874,21 @@
             </w:r>
           </w:p>
         </w:tc>
+        <w:tc>
+          <w:tcPr>
+            <w:tcW w:type="dxa" w:w="2880"/>
+          </w:tcPr>
+          <w:p>
+            <w:r>
+              <w:t>Ética (Dr. Godoy)</w:t>
+            </w:r>
+          </w:p>
+        </w:tc>
       </w:tr>
       <w:tr>
         <w:tc>
           <w:tcPr>
-            <w:tcW w:type="dxa" w:w="4320"/>
+            <w:tcW w:type="dxa" w:w="2880"/>
           </w:tcPr>
           <w:p>
             <w:r>
@@ -627,7 +898,7 @@
         </w:tc>
         <w:tc>
           <w:tcPr>
-            <w:tcW w:type="dxa" w:w="4320"/>
+            <w:tcW w:type="dxa" w:w="2880"/>
           </w:tcPr>
           <w:p>
             <w:r>
@@ -635,11 +906,21 @@
             </w:r>
           </w:p>
         </w:tc>
+        <w:tc>
+          <w:tcPr>
+            <w:tcW w:type="dxa" w:w="2880"/>
+          </w:tcPr>
+          <w:p>
+            <w:r>
+              <w:t>Ética (Dr. Godoy)</w:t>
+            </w:r>
+          </w:p>
+        </w:tc>
       </w:tr>
       <w:tr>
         <w:tc>
           <w:tcPr>
-            <w:tcW w:type="dxa" w:w="4320"/>
+            <w:tcW w:type="dxa" w:w="2880"/>
           </w:tcPr>
           <w:p>
             <w:r>
@@ -649,7 +930,7 @@
         </w:tc>
         <w:tc>
           <w:tcPr>
-            <w:tcW w:type="dxa" w:w="4320"/>
+            <w:tcW w:type="dxa" w:w="2880"/>
           </w:tcPr>
           <w:p>
             <w:r>
@@ -657,11 +938,21 @@
             </w:r>
           </w:p>
         </w:tc>
+        <w:tc>
+          <w:tcPr>
+            <w:tcW w:type="dxa" w:w="2880"/>
+          </w:tcPr>
+          <w:p>
+            <w:r>
+              <w:t>Ética (Dr. Godoy)</w:t>
+            </w:r>
+          </w:p>
+        </w:tc>
       </w:tr>
       <w:tr>
         <w:tc>
           <w:tcPr>
-            <w:tcW w:type="dxa" w:w="4320"/>
+            <w:tcW w:type="dxa" w:w="2880"/>
           </w:tcPr>
           <w:p>
             <w:r>
@@ -671,7 +962,7 @@
         </w:tc>
         <w:tc>
           <w:tcPr>
-            <w:tcW w:type="dxa" w:w="4320"/>
+            <w:tcW w:type="dxa" w:w="2880"/>
           </w:tcPr>
           <w:p>
             <w:r>
@@ -679,11 +970,21 @@
             </w:r>
           </w:p>
         </w:tc>
+        <w:tc>
+          <w:tcPr>
+            <w:tcW w:type="dxa" w:w="2880"/>
+          </w:tcPr>
+          <w:p>
+            <w:r>
+              <w:t>Materiales y Métodos (Dr. Marro)</w:t>
+            </w:r>
+          </w:p>
+        </w:tc>
       </w:tr>
       <w:tr>
         <w:tc>
           <w:tcPr>
-            <w:tcW w:type="dxa" w:w="4320"/>
+            <w:tcW w:type="dxa" w:w="2880"/>
           </w:tcPr>
           <w:p>
             <w:r>
@@ -693,7 +994,7 @@
         </w:tc>
         <w:tc>
           <w:tcPr>
-            <w:tcW w:type="dxa" w:w="4320"/>
+            <w:tcW w:type="dxa" w:w="2880"/>
           </w:tcPr>
           <w:p>
             <w:r>
@@ -701,11 +1002,21 @@
             </w:r>
           </w:p>
         </w:tc>
+        <w:tc>
+          <w:tcPr>
+            <w:tcW w:type="dxa" w:w="2880"/>
+          </w:tcPr>
+          <w:p>
+            <w:r>
+              <w:t>Materiales y Métodos (Dr. Marro)</w:t>
+            </w:r>
+          </w:p>
+        </w:tc>
       </w:tr>
       <w:tr>
         <w:tc>
           <w:tcPr>
-            <w:tcW w:type="dxa" w:w="4320"/>
+            <w:tcW w:type="dxa" w:w="2880"/>
           </w:tcPr>
           <w:p>
             <w:r>
@@ -715,7 +1026,7 @@
         </w:tc>
         <w:tc>
           <w:tcPr>
-            <w:tcW w:type="dxa" w:w="4320"/>
+            <w:tcW w:type="dxa" w:w="2880"/>
           </w:tcPr>
           <w:p>
             <w:r>
@@ -723,11 +1034,21 @@
             </w:r>
           </w:p>
         </w:tc>
+        <w:tc>
+          <w:tcPr>
+            <w:tcW w:type="dxa" w:w="2880"/>
+          </w:tcPr>
+          <w:p>
+            <w:r>
+              <w:t>Materiales y Métodos (Dr. Marro)</w:t>
+            </w:r>
+          </w:p>
+        </w:tc>
       </w:tr>
       <w:tr>
         <w:tc>
           <w:tcPr>
-            <w:tcW w:type="dxa" w:w="4320"/>
+            <w:tcW w:type="dxa" w:w="2880"/>
           </w:tcPr>
           <w:p>
             <w:r>
@@ -737,7 +1058,7 @@
         </w:tc>
         <w:tc>
           <w:tcPr>
-            <w:tcW w:type="dxa" w:w="4320"/>
+            <w:tcW w:type="dxa" w:w="2880"/>
           </w:tcPr>
           <w:p>
             <w:r>
@@ -745,11 +1066,21 @@
             </w:r>
           </w:p>
         </w:tc>
+        <w:tc>
+          <w:tcPr>
+            <w:tcW w:type="dxa" w:w="2880"/>
+          </w:tcPr>
+          <w:p>
+            <w:r>
+              <w:t>Materiales y Métodos (Dr. Marro)</w:t>
+            </w:r>
+          </w:p>
+        </w:tc>
       </w:tr>
       <w:tr>
         <w:tc>
           <w:tcPr>
-            <w:tcW w:type="dxa" w:w="4320"/>
+            <w:tcW w:type="dxa" w:w="2880"/>
           </w:tcPr>
           <w:p>
             <w:r>
@@ -759,7 +1090,7 @@
         </w:tc>
         <w:tc>
           <w:tcPr>
-            <w:tcW w:type="dxa" w:w="4320"/>
+            <w:tcW w:type="dxa" w:w="2880"/>
           </w:tcPr>
           <w:p>
             <w:r>
@@ -767,11 +1098,21 @@
             </w:r>
           </w:p>
         </w:tc>
+        <w:tc>
+          <w:tcPr>
+            <w:tcW w:type="dxa" w:w="2880"/>
+          </w:tcPr>
+          <w:p>
+            <w:r>
+              <w:t>Materiales y Métodos (Dr. Marro)</w:t>
+            </w:r>
+          </w:p>
+        </w:tc>
       </w:tr>
       <w:tr>
         <w:tc>
           <w:tcPr>
-            <w:tcW w:type="dxa" w:w="4320"/>
+            <w:tcW w:type="dxa" w:w="2880"/>
           </w:tcPr>
           <w:p>
             <w:r>
@@ -781,7 +1122,7 @@
         </w:tc>
         <w:tc>
           <w:tcPr>
-            <w:tcW w:type="dxa" w:w="4320"/>
+            <w:tcW w:type="dxa" w:w="2880"/>
           </w:tcPr>
           <w:p>
             <w:r>
@@ -789,11 +1130,21 @@
             </w:r>
           </w:p>
         </w:tc>
+        <w:tc>
+          <w:tcPr>
+            <w:tcW w:type="dxa" w:w="2880"/>
+          </w:tcPr>
+          <w:p>
+            <w:r>
+              <w:t>Materiales y Métodos (Dr. Marro)</w:t>
+            </w:r>
+          </w:p>
+        </w:tc>
       </w:tr>
       <w:tr>
         <w:tc>
           <w:tcPr>
-            <w:tcW w:type="dxa" w:w="4320"/>
+            <w:tcW w:type="dxa" w:w="2880"/>
           </w:tcPr>
           <w:p>
             <w:r>
@@ -803,7 +1154,7 @@
         </w:tc>
         <w:tc>
           <w:tcPr>
-            <w:tcW w:type="dxa" w:w="4320"/>
+            <w:tcW w:type="dxa" w:w="2880"/>
           </w:tcPr>
           <w:p>
             <w:r>
@@ -811,11 +1162,21 @@
             </w:r>
           </w:p>
         </w:tc>
+        <w:tc>
+          <w:tcPr>
+            <w:tcW w:type="dxa" w:w="2880"/>
+          </w:tcPr>
+          <w:p>
+            <w:r>
+              <w:t>Materiales y Métodos (Dr. Marro)</w:t>
+            </w:r>
+          </w:p>
+        </w:tc>
       </w:tr>
       <w:tr>
         <w:tc>
           <w:tcPr>
-            <w:tcW w:type="dxa" w:w="4320"/>
+            <w:tcW w:type="dxa" w:w="2880"/>
           </w:tcPr>
           <w:p>
             <w:r>
@@ -825,7 +1186,7 @@
         </w:tc>
         <w:tc>
           <w:tcPr>
-            <w:tcW w:type="dxa" w:w="4320"/>
+            <w:tcW w:type="dxa" w:w="2880"/>
           </w:tcPr>
           <w:p>
             <w:r>
@@ -833,11 +1194,21 @@
             </w:r>
           </w:p>
         </w:tc>
+        <w:tc>
+          <w:tcPr>
+            <w:tcW w:type="dxa" w:w="2880"/>
+          </w:tcPr>
+          <w:p>
+            <w:r>
+              <w:t>Metodología de revisiones (Klgo. Ramos)</w:t>
+            </w:r>
+          </w:p>
+        </w:tc>
       </w:tr>
       <w:tr>
         <w:tc>
           <w:tcPr>
-            <w:tcW w:type="dxa" w:w="4320"/>
+            <w:tcW w:type="dxa" w:w="2880"/>
           </w:tcPr>
           <w:p>
             <w:r>
@@ -847,7 +1218,7 @@
         </w:tc>
         <w:tc>
           <w:tcPr>
-            <w:tcW w:type="dxa" w:w="4320"/>
+            <w:tcW w:type="dxa" w:w="2880"/>
           </w:tcPr>
           <w:p>
             <w:r>
@@ -855,11 +1226,21 @@
             </w:r>
           </w:p>
         </w:tc>
+        <w:tc>
+          <w:tcPr>
+            <w:tcW w:type="dxa" w:w="2880"/>
+          </w:tcPr>
+          <w:p>
+            <w:r>
+              <w:t>Metodología de revisiones (Klgo. Ramos)</w:t>
+            </w:r>
+          </w:p>
+        </w:tc>
       </w:tr>
       <w:tr>
         <w:tc>
           <w:tcPr>
-            <w:tcW w:type="dxa" w:w="4320"/>
+            <w:tcW w:type="dxa" w:w="2880"/>
           </w:tcPr>
           <w:p>
             <w:r>
@@ -869,7 +1250,7 @@
         </w:tc>
         <w:tc>
           <w:tcPr>
-            <w:tcW w:type="dxa" w:w="4320"/>
+            <w:tcW w:type="dxa" w:w="2880"/>
           </w:tcPr>
           <w:p>
             <w:r>
@@ -877,11 +1258,21 @@
             </w:r>
           </w:p>
         </w:tc>
+        <w:tc>
+          <w:tcPr>
+            <w:tcW w:type="dxa" w:w="2880"/>
+          </w:tcPr>
+          <w:p>
+            <w:r>
+              <w:t>Metodología de revisiones (Klgo. Ramos)</w:t>
+            </w:r>
+          </w:p>
+        </w:tc>
       </w:tr>
       <w:tr>
         <w:tc>
           <w:tcPr>
-            <w:tcW w:type="dxa" w:w="4320"/>
+            <w:tcW w:type="dxa" w:w="2880"/>
           </w:tcPr>
           <w:p>
             <w:r>
@@ -891,7 +1282,7 @@
         </w:tc>
         <w:tc>
           <w:tcPr>
-            <w:tcW w:type="dxa" w:w="4320"/>
+            <w:tcW w:type="dxa" w:w="2880"/>
           </w:tcPr>
           <w:p>
             <w:r>
@@ -899,11 +1290,21 @@
             </w:r>
           </w:p>
         </w:tc>
+        <w:tc>
+          <w:tcPr>
+            <w:tcW w:type="dxa" w:w="2880"/>
+          </w:tcPr>
+          <w:p>
+            <w:r>
+              <w:t>Metodología de revisiones (Klgo. Ramos)</w:t>
+            </w:r>
+          </w:p>
+        </w:tc>
       </w:tr>
       <w:tr>
         <w:tc>
           <w:tcPr>
-            <w:tcW w:type="dxa" w:w="4320"/>
+            <w:tcW w:type="dxa" w:w="2880"/>
           </w:tcPr>
           <w:p>
             <w:r>
@@ -913,7 +1314,7 @@
         </w:tc>
         <w:tc>
           <w:tcPr>
-            <w:tcW w:type="dxa" w:w="4320"/>
+            <w:tcW w:type="dxa" w:w="2880"/>
           </w:tcPr>
           <w:p>
             <w:r>
@@ -921,8 +1322,24 @@
             </w:r>
           </w:p>
         </w:tc>
+        <w:tc>
+          <w:tcPr>
+            <w:tcW w:type="dxa" w:w="2880"/>
+          </w:tcPr>
+          <w:p>
+            <w:r>
+              <w:t>Metodología de revisiones (Klgo. Ramos)</w:t>
+            </w:r>
+          </w:p>
+        </w:tc>
       </w:tr>
     </w:tbl>
+    <w:p>
+      <w:r>
+        <w:br/>
+        <w:t>* Contenido que podría corresponder a clases anteriores al Certamen 1 (Síntesis de evidencia, Pregunta/PICO o Formato de protocolo); verificar si se desea mantener.</w:t>
+      </w:r>
+    </w:p>
     <w:sectPr>
       <w:pgSz w:w="12240" w:h="15840"/>
       <w:pgMar w:top="1440" w:right="1800" w:bottom="1440" w:left="1800" w:header="720" w:footer="720" w:gutter="0"/>

</xml_diff>